<commit_message>
removed 2 rows on table
</commit_message>
<xml_diff>
--- a/template_backup/template_original.docx
+++ b/template_backup/template_original.docx
@@ -1379,7 +1379,7 @@
                 <w:noProof/>
               </w:rPr>
               <w:drawing>
-                <wp:inline distT="0" distB="0" distL="0" distR="0" wp14:anchorId="6E61C2DC" wp14:editId="0854E51A">
+                <wp:inline distT="0" distB="0" distL="0" distR="0" wp14:anchorId="6E61C2DC" wp14:editId="3DBEEC51">
                   <wp:extent cx="603250" cy="189230"/>
                   <wp:effectExtent l="0" t="0" r="6350" b="1270"/>
                   <wp:docPr id="222251128" name="Picture 1"/>
@@ -2260,1290 +2260,6 @@
               </w:rPr>
               <w:t> </w:t>
             </w:r>
-          </w:p>
-        </w:tc>
-      </w:tr>
-      <w:tr>
-        <w:trPr>
-          <w:trHeight w:val="361"/>
-        </w:trPr>
-        <w:tc>
-          <w:tcPr>
-            <w:tcW w:w="252" w:type="pct"/>
-            <w:tcBorders>
-              <w:top w:val="nil"/>
-              <w:left w:val="single" w:sz="4" w:space="0" w:color="auto"/>
-              <w:bottom w:val="single" w:sz="4" w:space="0" w:color="auto"/>
-              <w:right w:val="single" w:sz="4" w:space="0" w:color="auto"/>
-            </w:tcBorders>
-            <w:noWrap/>
-            <w:vAlign w:val="bottom"/>
-          </w:tcPr>
-          <w:p>
-            <w:pPr>
-              <w:spacing w:after="0" w:line="240" w:lineRule="auto"/>
-              <w:rPr>
-                <w:rFonts w:ascii="Calibri" w:eastAsia="Times New Roman" w:hAnsi="Calibri" w:cs="Calibri"/>
-                <w:color w:val="000000"/>
-                <w:lang w:eastAsia="en-AE"/>
-              </w:rPr>
-            </w:pPr>
-          </w:p>
-        </w:tc>
-        <w:tc>
-          <w:tcPr>
-            <w:tcW w:w="376" w:type="pct"/>
-            <w:tcBorders>
-              <w:top w:val="nil"/>
-              <w:left w:val="nil"/>
-              <w:bottom w:val="single" w:sz="4" w:space="0" w:color="auto"/>
-              <w:right w:val="single" w:sz="4" w:space="0" w:color="auto"/>
-            </w:tcBorders>
-            <w:noWrap/>
-            <w:vAlign w:val="bottom"/>
-          </w:tcPr>
-          <w:p>
-            <w:pPr>
-              <w:spacing w:after="0" w:line="240" w:lineRule="auto"/>
-              <w:rPr>
-                <w:rFonts w:ascii="Calibri" w:eastAsia="Times New Roman" w:hAnsi="Calibri" w:cs="Calibri"/>
-                <w:color w:val="000000"/>
-                <w:lang w:eastAsia="en-AE"/>
-              </w:rPr>
-            </w:pPr>
-          </w:p>
-        </w:tc>
-        <w:tc>
-          <w:tcPr>
-            <w:tcW w:w="793" w:type="pct"/>
-            <w:tcBorders>
-              <w:top w:val="nil"/>
-              <w:left w:val="nil"/>
-              <w:bottom w:val="single" w:sz="4" w:space="0" w:color="auto"/>
-              <w:right w:val="single" w:sz="4" w:space="0" w:color="auto"/>
-            </w:tcBorders>
-            <w:noWrap/>
-            <w:vAlign w:val="bottom"/>
-          </w:tcPr>
-          <w:p>
-            <w:pPr>
-              <w:spacing w:after="0" w:line="240" w:lineRule="auto"/>
-              <w:rPr>
-                <w:rFonts w:ascii="Calibri" w:eastAsia="Times New Roman" w:hAnsi="Calibri" w:cs="Calibri"/>
-                <w:color w:val="000000"/>
-                <w:lang w:eastAsia="en-AE"/>
-              </w:rPr>
-            </w:pPr>
-          </w:p>
-        </w:tc>
-        <w:tc>
-          <w:tcPr>
-            <w:tcW w:w="610" w:type="pct"/>
-            <w:gridSpan w:val="2"/>
-            <w:tcBorders>
-              <w:top w:val="nil"/>
-              <w:left w:val="nil"/>
-              <w:bottom w:val="single" w:sz="4" w:space="0" w:color="auto"/>
-              <w:right w:val="single" w:sz="4" w:space="0" w:color="auto"/>
-            </w:tcBorders>
-            <w:noWrap/>
-            <w:vAlign w:val="bottom"/>
-          </w:tcPr>
-          <w:p>
-            <w:pPr>
-              <w:spacing w:after="0" w:line="240" w:lineRule="auto"/>
-              <w:rPr>
-                <w:rFonts w:ascii="Calibri" w:eastAsia="Times New Roman" w:hAnsi="Calibri" w:cs="Calibri"/>
-                <w:color w:val="000000"/>
-                <w:lang w:eastAsia="en-AE"/>
-              </w:rPr>
-            </w:pPr>
-          </w:p>
-        </w:tc>
-        <w:tc>
-          <w:tcPr>
-            <w:tcW w:w="496" w:type="pct"/>
-            <w:tcBorders>
-              <w:top w:val="nil"/>
-              <w:left w:val="nil"/>
-              <w:bottom w:val="single" w:sz="4" w:space="0" w:color="auto"/>
-              <w:right w:val="single" w:sz="4" w:space="0" w:color="auto"/>
-            </w:tcBorders>
-            <w:noWrap/>
-            <w:vAlign w:val="bottom"/>
-          </w:tcPr>
-          <w:p>
-            <w:pPr>
-              <w:spacing w:after="0" w:line="240" w:lineRule="auto"/>
-              <w:rPr>
-                <w:rFonts w:ascii="Calibri" w:eastAsia="Times New Roman" w:hAnsi="Calibri" w:cs="Calibri"/>
-                <w:color w:val="000000"/>
-                <w:lang w:eastAsia="en-AE"/>
-              </w:rPr>
-            </w:pPr>
-          </w:p>
-        </w:tc>
-        <w:tc>
-          <w:tcPr>
-            <w:tcW w:w="418" w:type="pct"/>
-            <w:tcBorders>
-              <w:top w:val="nil"/>
-              <w:left w:val="nil"/>
-              <w:bottom w:val="single" w:sz="4" w:space="0" w:color="auto"/>
-              <w:right w:val="single" w:sz="4" w:space="0" w:color="auto"/>
-            </w:tcBorders>
-            <w:noWrap/>
-            <w:vAlign w:val="bottom"/>
-          </w:tcPr>
-          <w:p>
-            <w:pPr>
-              <w:spacing w:after="0" w:line="240" w:lineRule="auto"/>
-              <w:rPr>
-                <w:rFonts w:ascii="Calibri" w:eastAsia="Times New Roman" w:hAnsi="Calibri" w:cs="Calibri"/>
-                <w:color w:val="000000"/>
-                <w:lang w:eastAsia="en-AE"/>
-              </w:rPr>
-            </w:pPr>
-          </w:p>
-        </w:tc>
-        <w:tc>
-          <w:tcPr>
-            <w:tcW w:w="678" w:type="pct"/>
-            <w:tcBorders>
-              <w:top w:val="nil"/>
-              <w:left w:val="nil"/>
-              <w:bottom w:val="single" w:sz="4" w:space="0" w:color="auto"/>
-              <w:right w:val="single" w:sz="4" w:space="0" w:color="auto"/>
-            </w:tcBorders>
-            <w:noWrap/>
-            <w:vAlign w:val="bottom"/>
-          </w:tcPr>
-          <w:p>
-            <w:pPr>
-              <w:spacing w:after="0" w:line="240" w:lineRule="auto"/>
-              <w:rPr>
-                <w:rFonts w:ascii="Calibri" w:eastAsia="Times New Roman" w:hAnsi="Calibri" w:cs="Calibri"/>
-                <w:color w:val="000000"/>
-                <w:lang w:eastAsia="en-AE"/>
-              </w:rPr>
-            </w:pPr>
-          </w:p>
-        </w:tc>
-        <w:tc>
-          <w:tcPr>
-            <w:tcW w:w="440" w:type="pct"/>
-            <w:gridSpan w:val="2"/>
-            <w:tcBorders>
-              <w:top w:val="nil"/>
-              <w:left w:val="nil"/>
-              <w:bottom w:val="single" w:sz="4" w:space="0" w:color="auto"/>
-              <w:right w:val="single" w:sz="4" w:space="0" w:color="auto"/>
-            </w:tcBorders>
-            <w:noWrap/>
-            <w:vAlign w:val="bottom"/>
-          </w:tcPr>
-          <w:p>
-            <w:pPr>
-              <w:spacing w:after="0" w:line="240" w:lineRule="auto"/>
-              <w:rPr>
-                <w:rFonts w:ascii="Calibri" w:eastAsia="Times New Roman" w:hAnsi="Calibri" w:cs="Calibri"/>
-                <w:color w:val="000000"/>
-                <w:lang w:eastAsia="en-AE"/>
-              </w:rPr>
-            </w:pPr>
-          </w:p>
-        </w:tc>
-        <w:tc>
-          <w:tcPr>
-            <w:tcW w:w="937" w:type="pct"/>
-            <w:tcBorders>
-              <w:top w:val="nil"/>
-              <w:left w:val="nil"/>
-              <w:bottom w:val="single" w:sz="4" w:space="0" w:color="auto"/>
-              <w:right w:val="single" w:sz="4" w:space="0" w:color="auto"/>
-            </w:tcBorders>
-            <w:noWrap/>
-            <w:vAlign w:val="bottom"/>
-          </w:tcPr>
-          <w:p>
-            <w:pPr>
-              <w:spacing w:after="0" w:line="240" w:lineRule="auto"/>
-              <w:rPr>
-                <w:rFonts w:ascii="Calibri" w:eastAsia="Times New Roman" w:hAnsi="Calibri" w:cs="Calibri"/>
-                <w:color w:val="000000"/>
-                <w:lang w:eastAsia="en-AE"/>
-              </w:rPr>
-            </w:pPr>
-          </w:p>
-        </w:tc>
-      </w:tr>
-      <w:tr>
-        <w:trPr>
-          <w:trHeight w:val="361"/>
-        </w:trPr>
-        <w:tc>
-          <w:tcPr>
-            <w:tcW w:w="252" w:type="pct"/>
-            <w:tcBorders>
-              <w:top w:val="nil"/>
-              <w:left w:val="single" w:sz="4" w:space="0" w:color="auto"/>
-              <w:bottom w:val="single" w:sz="4" w:space="0" w:color="auto"/>
-              <w:right w:val="single" w:sz="4" w:space="0" w:color="auto"/>
-            </w:tcBorders>
-            <w:noWrap/>
-            <w:vAlign w:val="bottom"/>
-          </w:tcPr>
-          <w:p>
-            <w:pPr>
-              <w:spacing w:after="0" w:line="240" w:lineRule="auto"/>
-              <w:rPr>
-                <w:rFonts w:ascii="Calibri" w:eastAsia="Times New Roman" w:hAnsi="Calibri" w:cs="Calibri"/>
-                <w:color w:val="000000"/>
-                <w:lang w:eastAsia="en-AE"/>
-              </w:rPr>
-            </w:pPr>
-          </w:p>
-        </w:tc>
-        <w:tc>
-          <w:tcPr>
-            <w:tcW w:w="376" w:type="pct"/>
-            <w:tcBorders>
-              <w:top w:val="nil"/>
-              <w:left w:val="nil"/>
-              <w:bottom w:val="single" w:sz="4" w:space="0" w:color="auto"/>
-              <w:right w:val="single" w:sz="4" w:space="0" w:color="auto"/>
-            </w:tcBorders>
-            <w:noWrap/>
-            <w:vAlign w:val="bottom"/>
-          </w:tcPr>
-          <w:p>
-            <w:pPr>
-              <w:spacing w:after="0" w:line="240" w:lineRule="auto"/>
-              <w:rPr>
-                <w:rFonts w:ascii="Calibri" w:eastAsia="Times New Roman" w:hAnsi="Calibri" w:cs="Calibri"/>
-                <w:color w:val="000000"/>
-                <w:lang w:eastAsia="en-AE"/>
-              </w:rPr>
-            </w:pPr>
-          </w:p>
-        </w:tc>
-        <w:tc>
-          <w:tcPr>
-            <w:tcW w:w="793" w:type="pct"/>
-            <w:tcBorders>
-              <w:top w:val="nil"/>
-              <w:left w:val="nil"/>
-              <w:bottom w:val="single" w:sz="4" w:space="0" w:color="auto"/>
-              <w:right w:val="single" w:sz="4" w:space="0" w:color="auto"/>
-            </w:tcBorders>
-            <w:noWrap/>
-            <w:vAlign w:val="bottom"/>
-          </w:tcPr>
-          <w:p>
-            <w:pPr>
-              <w:spacing w:after="0" w:line="240" w:lineRule="auto"/>
-              <w:rPr>
-                <w:rFonts w:ascii="Calibri" w:eastAsia="Times New Roman" w:hAnsi="Calibri" w:cs="Calibri"/>
-                <w:color w:val="000000"/>
-                <w:lang w:eastAsia="en-AE"/>
-              </w:rPr>
-            </w:pPr>
-          </w:p>
-        </w:tc>
-        <w:tc>
-          <w:tcPr>
-            <w:tcW w:w="610" w:type="pct"/>
-            <w:gridSpan w:val="2"/>
-            <w:tcBorders>
-              <w:top w:val="nil"/>
-              <w:left w:val="nil"/>
-              <w:bottom w:val="single" w:sz="4" w:space="0" w:color="auto"/>
-              <w:right w:val="single" w:sz="4" w:space="0" w:color="auto"/>
-            </w:tcBorders>
-            <w:noWrap/>
-            <w:vAlign w:val="bottom"/>
-          </w:tcPr>
-          <w:p>
-            <w:pPr>
-              <w:spacing w:after="0" w:line="240" w:lineRule="auto"/>
-              <w:rPr>
-                <w:rFonts w:ascii="Calibri" w:eastAsia="Times New Roman" w:hAnsi="Calibri" w:cs="Calibri"/>
-                <w:color w:val="000000"/>
-                <w:lang w:eastAsia="en-AE"/>
-              </w:rPr>
-            </w:pPr>
-          </w:p>
-        </w:tc>
-        <w:tc>
-          <w:tcPr>
-            <w:tcW w:w="496" w:type="pct"/>
-            <w:tcBorders>
-              <w:top w:val="nil"/>
-              <w:left w:val="nil"/>
-              <w:bottom w:val="single" w:sz="4" w:space="0" w:color="auto"/>
-              <w:right w:val="single" w:sz="4" w:space="0" w:color="auto"/>
-            </w:tcBorders>
-            <w:noWrap/>
-            <w:vAlign w:val="bottom"/>
-          </w:tcPr>
-          <w:p>
-            <w:pPr>
-              <w:spacing w:after="0" w:line="240" w:lineRule="auto"/>
-              <w:rPr>
-                <w:rFonts w:ascii="Calibri" w:eastAsia="Times New Roman" w:hAnsi="Calibri" w:cs="Calibri"/>
-                <w:color w:val="000000"/>
-                <w:lang w:eastAsia="en-AE"/>
-              </w:rPr>
-            </w:pPr>
-          </w:p>
-        </w:tc>
-        <w:tc>
-          <w:tcPr>
-            <w:tcW w:w="418" w:type="pct"/>
-            <w:tcBorders>
-              <w:top w:val="nil"/>
-              <w:left w:val="nil"/>
-              <w:bottom w:val="single" w:sz="4" w:space="0" w:color="auto"/>
-              <w:right w:val="single" w:sz="4" w:space="0" w:color="auto"/>
-            </w:tcBorders>
-            <w:noWrap/>
-            <w:vAlign w:val="bottom"/>
-          </w:tcPr>
-          <w:p>
-            <w:pPr>
-              <w:spacing w:after="0" w:line="240" w:lineRule="auto"/>
-              <w:rPr>
-                <w:rFonts w:ascii="Calibri" w:eastAsia="Times New Roman" w:hAnsi="Calibri" w:cs="Calibri"/>
-                <w:color w:val="000000"/>
-                <w:lang w:eastAsia="en-AE"/>
-              </w:rPr>
-            </w:pPr>
-          </w:p>
-        </w:tc>
-        <w:tc>
-          <w:tcPr>
-            <w:tcW w:w="678" w:type="pct"/>
-            <w:tcBorders>
-              <w:top w:val="nil"/>
-              <w:left w:val="nil"/>
-              <w:bottom w:val="single" w:sz="4" w:space="0" w:color="auto"/>
-              <w:right w:val="single" w:sz="4" w:space="0" w:color="auto"/>
-            </w:tcBorders>
-            <w:noWrap/>
-            <w:vAlign w:val="bottom"/>
-          </w:tcPr>
-          <w:p>
-            <w:pPr>
-              <w:spacing w:after="0" w:line="240" w:lineRule="auto"/>
-              <w:rPr>
-                <w:rFonts w:ascii="Calibri" w:eastAsia="Times New Roman" w:hAnsi="Calibri" w:cs="Calibri"/>
-                <w:color w:val="000000"/>
-                <w:lang w:eastAsia="en-AE"/>
-              </w:rPr>
-            </w:pPr>
-          </w:p>
-        </w:tc>
-        <w:tc>
-          <w:tcPr>
-            <w:tcW w:w="440" w:type="pct"/>
-            <w:gridSpan w:val="2"/>
-            <w:tcBorders>
-              <w:top w:val="nil"/>
-              <w:left w:val="nil"/>
-              <w:bottom w:val="single" w:sz="4" w:space="0" w:color="auto"/>
-              <w:right w:val="single" w:sz="4" w:space="0" w:color="auto"/>
-            </w:tcBorders>
-            <w:noWrap/>
-            <w:vAlign w:val="bottom"/>
-          </w:tcPr>
-          <w:p>
-            <w:pPr>
-              <w:spacing w:after="0" w:line="240" w:lineRule="auto"/>
-              <w:rPr>
-                <w:rFonts w:ascii="Calibri" w:eastAsia="Times New Roman" w:hAnsi="Calibri" w:cs="Calibri"/>
-                <w:color w:val="000000"/>
-                <w:lang w:eastAsia="en-AE"/>
-              </w:rPr>
-            </w:pPr>
-          </w:p>
-        </w:tc>
-        <w:tc>
-          <w:tcPr>
-            <w:tcW w:w="937" w:type="pct"/>
-            <w:tcBorders>
-              <w:top w:val="nil"/>
-              <w:left w:val="nil"/>
-              <w:bottom w:val="single" w:sz="4" w:space="0" w:color="auto"/>
-              <w:right w:val="single" w:sz="4" w:space="0" w:color="auto"/>
-            </w:tcBorders>
-            <w:noWrap/>
-            <w:vAlign w:val="bottom"/>
-          </w:tcPr>
-          <w:p>
-            <w:pPr>
-              <w:spacing w:after="0" w:line="240" w:lineRule="auto"/>
-              <w:rPr>
-                <w:rFonts w:ascii="Calibri" w:eastAsia="Times New Roman" w:hAnsi="Calibri" w:cs="Calibri"/>
-                <w:color w:val="000000"/>
-                <w:lang w:eastAsia="en-AE"/>
-              </w:rPr>
-            </w:pPr>
-          </w:p>
-        </w:tc>
-      </w:tr>
-      <w:tr>
-        <w:trPr>
-          <w:trHeight w:val="361"/>
-        </w:trPr>
-        <w:tc>
-          <w:tcPr>
-            <w:tcW w:w="252" w:type="pct"/>
-            <w:tcBorders>
-              <w:top w:val="nil"/>
-              <w:left w:val="single" w:sz="4" w:space="0" w:color="auto"/>
-              <w:bottom w:val="single" w:sz="4" w:space="0" w:color="auto"/>
-              <w:right w:val="single" w:sz="4" w:space="0" w:color="auto"/>
-            </w:tcBorders>
-            <w:noWrap/>
-            <w:vAlign w:val="bottom"/>
-          </w:tcPr>
-          <w:p>
-            <w:pPr>
-              <w:spacing w:after="0" w:line="240" w:lineRule="auto"/>
-              <w:rPr>
-                <w:rFonts w:ascii="Calibri" w:eastAsia="Times New Roman" w:hAnsi="Calibri" w:cs="Calibri"/>
-                <w:color w:val="000000"/>
-                <w:lang w:eastAsia="en-AE"/>
-              </w:rPr>
-            </w:pPr>
-          </w:p>
-        </w:tc>
-        <w:tc>
-          <w:tcPr>
-            <w:tcW w:w="376" w:type="pct"/>
-            <w:tcBorders>
-              <w:top w:val="nil"/>
-              <w:left w:val="nil"/>
-              <w:bottom w:val="single" w:sz="4" w:space="0" w:color="auto"/>
-              <w:right w:val="single" w:sz="4" w:space="0" w:color="auto"/>
-            </w:tcBorders>
-            <w:noWrap/>
-            <w:vAlign w:val="bottom"/>
-          </w:tcPr>
-          <w:p>
-            <w:pPr>
-              <w:spacing w:after="0" w:line="240" w:lineRule="auto"/>
-              <w:rPr>
-                <w:rFonts w:ascii="Calibri" w:eastAsia="Times New Roman" w:hAnsi="Calibri" w:cs="Calibri"/>
-                <w:color w:val="000000"/>
-                <w:lang w:eastAsia="en-AE"/>
-              </w:rPr>
-            </w:pPr>
-          </w:p>
-        </w:tc>
-        <w:tc>
-          <w:tcPr>
-            <w:tcW w:w="793" w:type="pct"/>
-            <w:tcBorders>
-              <w:top w:val="nil"/>
-              <w:left w:val="nil"/>
-              <w:bottom w:val="single" w:sz="4" w:space="0" w:color="auto"/>
-              <w:right w:val="single" w:sz="4" w:space="0" w:color="auto"/>
-            </w:tcBorders>
-            <w:noWrap/>
-            <w:vAlign w:val="bottom"/>
-          </w:tcPr>
-          <w:p>
-            <w:pPr>
-              <w:spacing w:after="0" w:line="240" w:lineRule="auto"/>
-              <w:rPr>
-                <w:rFonts w:ascii="Calibri" w:eastAsia="Times New Roman" w:hAnsi="Calibri" w:cs="Calibri"/>
-                <w:color w:val="000000"/>
-                <w:lang w:eastAsia="en-AE"/>
-              </w:rPr>
-            </w:pPr>
-          </w:p>
-        </w:tc>
-        <w:tc>
-          <w:tcPr>
-            <w:tcW w:w="610" w:type="pct"/>
-            <w:gridSpan w:val="2"/>
-            <w:tcBorders>
-              <w:top w:val="nil"/>
-              <w:left w:val="nil"/>
-              <w:bottom w:val="single" w:sz="4" w:space="0" w:color="auto"/>
-              <w:right w:val="single" w:sz="4" w:space="0" w:color="auto"/>
-            </w:tcBorders>
-            <w:noWrap/>
-            <w:vAlign w:val="bottom"/>
-          </w:tcPr>
-          <w:p>
-            <w:pPr>
-              <w:spacing w:after="0" w:line="240" w:lineRule="auto"/>
-              <w:rPr>
-                <w:rFonts w:ascii="Calibri" w:eastAsia="Times New Roman" w:hAnsi="Calibri" w:cs="Calibri"/>
-                <w:color w:val="000000"/>
-                <w:lang w:eastAsia="en-AE"/>
-              </w:rPr>
-            </w:pPr>
-          </w:p>
-        </w:tc>
-        <w:tc>
-          <w:tcPr>
-            <w:tcW w:w="496" w:type="pct"/>
-            <w:tcBorders>
-              <w:top w:val="nil"/>
-              <w:left w:val="nil"/>
-              <w:bottom w:val="single" w:sz="4" w:space="0" w:color="auto"/>
-              <w:right w:val="single" w:sz="4" w:space="0" w:color="auto"/>
-            </w:tcBorders>
-            <w:noWrap/>
-            <w:vAlign w:val="bottom"/>
-          </w:tcPr>
-          <w:p>
-            <w:pPr>
-              <w:spacing w:after="0" w:line="240" w:lineRule="auto"/>
-              <w:rPr>
-                <w:rFonts w:ascii="Calibri" w:eastAsia="Times New Roman" w:hAnsi="Calibri" w:cs="Calibri"/>
-                <w:color w:val="000000"/>
-                <w:lang w:eastAsia="en-AE"/>
-              </w:rPr>
-            </w:pPr>
-          </w:p>
-        </w:tc>
-        <w:tc>
-          <w:tcPr>
-            <w:tcW w:w="418" w:type="pct"/>
-            <w:tcBorders>
-              <w:top w:val="nil"/>
-              <w:left w:val="nil"/>
-              <w:bottom w:val="single" w:sz="4" w:space="0" w:color="auto"/>
-              <w:right w:val="single" w:sz="4" w:space="0" w:color="auto"/>
-            </w:tcBorders>
-            <w:noWrap/>
-            <w:vAlign w:val="bottom"/>
-          </w:tcPr>
-          <w:p>
-            <w:pPr>
-              <w:spacing w:after="0" w:line="240" w:lineRule="auto"/>
-              <w:rPr>
-                <w:rFonts w:ascii="Calibri" w:eastAsia="Times New Roman" w:hAnsi="Calibri" w:cs="Calibri"/>
-                <w:color w:val="000000"/>
-                <w:lang w:eastAsia="en-AE"/>
-              </w:rPr>
-            </w:pPr>
-          </w:p>
-        </w:tc>
-        <w:tc>
-          <w:tcPr>
-            <w:tcW w:w="678" w:type="pct"/>
-            <w:tcBorders>
-              <w:top w:val="nil"/>
-              <w:left w:val="nil"/>
-              <w:bottom w:val="single" w:sz="4" w:space="0" w:color="auto"/>
-              <w:right w:val="single" w:sz="4" w:space="0" w:color="auto"/>
-            </w:tcBorders>
-            <w:noWrap/>
-            <w:vAlign w:val="bottom"/>
-          </w:tcPr>
-          <w:p>
-            <w:pPr>
-              <w:spacing w:after="0" w:line="240" w:lineRule="auto"/>
-              <w:rPr>
-                <w:rFonts w:ascii="Calibri" w:eastAsia="Times New Roman" w:hAnsi="Calibri" w:cs="Calibri"/>
-                <w:color w:val="000000"/>
-                <w:lang w:eastAsia="en-AE"/>
-              </w:rPr>
-            </w:pPr>
-          </w:p>
-        </w:tc>
-        <w:tc>
-          <w:tcPr>
-            <w:tcW w:w="440" w:type="pct"/>
-            <w:gridSpan w:val="2"/>
-            <w:tcBorders>
-              <w:top w:val="nil"/>
-              <w:left w:val="nil"/>
-              <w:bottom w:val="single" w:sz="4" w:space="0" w:color="auto"/>
-              <w:right w:val="single" w:sz="4" w:space="0" w:color="auto"/>
-            </w:tcBorders>
-            <w:noWrap/>
-            <w:vAlign w:val="bottom"/>
-          </w:tcPr>
-          <w:p>
-            <w:pPr>
-              <w:spacing w:after="0" w:line="240" w:lineRule="auto"/>
-              <w:rPr>
-                <w:rFonts w:ascii="Calibri" w:eastAsia="Times New Roman" w:hAnsi="Calibri" w:cs="Calibri"/>
-                <w:color w:val="000000"/>
-                <w:lang w:eastAsia="en-AE"/>
-              </w:rPr>
-            </w:pPr>
-          </w:p>
-        </w:tc>
-        <w:tc>
-          <w:tcPr>
-            <w:tcW w:w="937" w:type="pct"/>
-            <w:tcBorders>
-              <w:top w:val="nil"/>
-              <w:left w:val="nil"/>
-              <w:bottom w:val="single" w:sz="4" w:space="0" w:color="auto"/>
-              <w:right w:val="single" w:sz="4" w:space="0" w:color="auto"/>
-            </w:tcBorders>
-            <w:noWrap/>
-            <w:vAlign w:val="bottom"/>
-          </w:tcPr>
-          <w:p>
-            <w:pPr>
-              <w:spacing w:after="0" w:line="240" w:lineRule="auto"/>
-              <w:rPr>
-                <w:rFonts w:ascii="Calibri" w:eastAsia="Times New Roman" w:hAnsi="Calibri" w:cs="Calibri"/>
-                <w:color w:val="000000"/>
-                <w:lang w:eastAsia="en-AE"/>
-              </w:rPr>
-            </w:pPr>
-          </w:p>
-        </w:tc>
-      </w:tr>
-      <w:tr>
-        <w:trPr>
-          <w:trHeight w:val="361"/>
-        </w:trPr>
-        <w:tc>
-          <w:tcPr>
-            <w:tcW w:w="252" w:type="pct"/>
-            <w:tcBorders>
-              <w:top w:val="nil"/>
-              <w:left w:val="single" w:sz="4" w:space="0" w:color="auto"/>
-              <w:bottom w:val="single" w:sz="4" w:space="0" w:color="auto"/>
-              <w:right w:val="single" w:sz="4" w:space="0" w:color="auto"/>
-            </w:tcBorders>
-            <w:noWrap/>
-            <w:vAlign w:val="bottom"/>
-          </w:tcPr>
-          <w:p>
-            <w:pPr>
-              <w:spacing w:after="0" w:line="240" w:lineRule="auto"/>
-              <w:rPr>
-                <w:rFonts w:ascii="Calibri" w:eastAsia="Times New Roman" w:hAnsi="Calibri" w:cs="Calibri"/>
-                <w:color w:val="000000"/>
-                <w:lang w:eastAsia="en-AE"/>
-              </w:rPr>
-            </w:pPr>
-          </w:p>
-        </w:tc>
-        <w:tc>
-          <w:tcPr>
-            <w:tcW w:w="376" w:type="pct"/>
-            <w:tcBorders>
-              <w:top w:val="nil"/>
-              <w:left w:val="nil"/>
-              <w:bottom w:val="single" w:sz="4" w:space="0" w:color="auto"/>
-              <w:right w:val="single" w:sz="4" w:space="0" w:color="auto"/>
-            </w:tcBorders>
-            <w:noWrap/>
-            <w:vAlign w:val="bottom"/>
-          </w:tcPr>
-          <w:p>
-            <w:pPr>
-              <w:spacing w:after="0" w:line="240" w:lineRule="auto"/>
-              <w:rPr>
-                <w:rFonts w:ascii="Calibri" w:eastAsia="Times New Roman" w:hAnsi="Calibri" w:cs="Calibri"/>
-                <w:color w:val="000000"/>
-                <w:lang w:eastAsia="en-AE"/>
-              </w:rPr>
-            </w:pPr>
-          </w:p>
-        </w:tc>
-        <w:tc>
-          <w:tcPr>
-            <w:tcW w:w="793" w:type="pct"/>
-            <w:tcBorders>
-              <w:top w:val="nil"/>
-              <w:left w:val="nil"/>
-              <w:bottom w:val="single" w:sz="4" w:space="0" w:color="auto"/>
-              <w:right w:val="single" w:sz="4" w:space="0" w:color="auto"/>
-            </w:tcBorders>
-            <w:noWrap/>
-            <w:vAlign w:val="bottom"/>
-          </w:tcPr>
-          <w:p>
-            <w:pPr>
-              <w:spacing w:after="0" w:line="240" w:lineRule="auto"/>
-              <w:rPr>
-                <w:rFonts w:ascii="Calibri" w:eastAsia="Times New Roman" w:hAnsi="Calibri" w:cs="Calibri"/>
-                <w:color w:val="000000"/>
-                <w:lang w:eastAsia="en-AE"/>
-              </w:rPr>
-            </w:pPr>
-          </w:p>
-        </w:tc>
-        <w:tc>
-          <w:tcPr>
-            <w:tcW w:w="610" w:type="pct"/>
-            <w:gridSpan w:val="2"/>
-            <w:tcBorders>
-              <w:top w:val="nil"/>
-              <w:left w:val="nil"/>
-              <w:bottom w:val="single" w:sz="4" w:space="0" w:color="auto"/>
-              <w:right w:val="single" w:sz="4" w:space="0" w:color="auto"/>
-            </w:tcBorders>
-            <w:noWrap/>
-            <w:vAlign w:val="bottom"/>
-          </w:tcPr>
-          <w:p>
-            <w:pPr>
-              <w:spacing w:after="0" w:line="240" w:lineRule="auto"/>
-              <w:rPr>
-                <w:rFonts w:ascii="Calibri" w:eastAsia="Times New Roman" w:hAnsi="Calibri" w:cs="Calibri"/>
-                <w:color w:val="000000"/>
-                <w:lang w:eastAsia="en-AE"/>
-              </w:rPr>
-            </w:pPr>
-          </w:p>
-        </w:tc>
-        <w:tc>
-          <w:tcPr>
-            <w:tcW w:w="496" w:type="pct"/>
-            <w:tcBorders>
-              <w:top w:val="nil"/>
-              <w:left w:val="nil"/>
-              <w:bottom w:val="single" w:sz="4" w:space="0" w:color="auto"/>
-              <w:right w:val="single" w:sz="4" w:space="0" w:color="auto"/>
-            </w:tcBorders>
-            <w:noWrap/>
-            <w:vAlign w:val="bottom"/>
-          </w:tcPr>
-          <w:p>
-            <w:pPr>
-              <w:spacing w:after="0" w:line="240" w:lineRule="auto"/>
-              <w:rPr>
-                <w:rFonts w:ascii="Calibri" w:eastAsia="Times New Roman" w:hAnsi="Calibri" w:cs="Calibri"/>
-                <w:color w:val="000000"/>
-                <w:lang w:eastAsia="en-AE"/>
-              </w:rPr>
-            </w:pPr>
-          </w:p>
-        </w:tc>
-        <w:tc>
-          <w:tcPr>
-            <w:tcW w:w="418" w:type="pct"/>
-            <w:tcBorders>
-              <w:top w:val="nil"/>
-              <w:left w:val="nil"/>
-              <w:bottom w:val="single" w:sz="4" w:space="0" w:color="auto"/>
-              <w:right w:val="single" w:sz="4" w:space="0" w:color="auto"/>
-            </w:tcBorders>
-            <w:noWrap/>
-            <w:vAlign w:val="bottom"/>
-          </w:tcPr>
-          <w:p>
-            <w:pPr>
-              <w:spacing w:after="0" w:line="240" w:lineRule="auto"/>
-              <w:rPr>
-                <w:rFonts w:ascii="Calibri" w:eastAsia="Times New Roman" w:hAnsi="Calibri" w:cs="Calibri"/>
-                <w:color w:val="000000"/>
-                <w:lang w:eastAsia="en-AE"/>
-              </w:rPr>
-            </w:pPr>
-          </w:p>
-        </w:tc>
-        <w:tc>
-          <w:tcPr>
-            <w:tcW w:w="678" w:type="pct"/>
-            <w:tcBorders>
-              <w:top w:val="nil"/>
-              <w:left w:val="nil"/>
-              <w:bottom w:val="single" w:sz="4" w:space="0" w:color="auto"/>
-              <w:right w:val="single" w:sz="4" w:space="0" w:color="auto"/>
-            </w:tcBorders>
-            <w:noWrap/>
-            <w:vAlign w:val="bottom"/>
-          </w:tcPr>
-          <w:p>
-            <w:pPr>
-              <w:spacing w:after="0" w:line="240" w:lineRule="auto"/>
-              <w:rPr>
-                <w:rFonts w:ascii="Calibri" w:eastAsia="Times New Roman" w:hAnsi="Calibri" w:cs="Calibri"/>
-                <w:color w:val="000000"/>
-                <w:lang w:eastAsia="en-AE"/>
-              </w:rPr>
-            </w:pPr>
-          </w:p>
-        </w:tc>
-        <w:tc>
-          <w:tcPr>
-            <w:tcW w:w="440" w:type="pct"/>
-            <w:gridSpan w:val="2"/>
-            <w:tcBorders>
-              <w:top w:val="nil"/>
-              <w:left w:val="nil"/>
-              <w:bottom w:val="single" w:sz="4" w:space="0" w:color="auto"/>
-              <w:right w:val="single" w:sz="4" w:space="0" w:color="auto"/>
-            </w:tcBorders>
-            <w:noWrap/>
-            <w:vAlign w:val="bottom"/>
-          </w:tcPr>
-          <w:p>
-            <w:pPr>
-              <w:spacing w:after="0" w:line="240" w:lineRule="auto"/>
-              <w:rPr>
-                <w:rFonts w:ascii="Calibri" w:eastAsia="Times New Roman" w:hAnsi="Calibri" w:cs="Calibri"/>
-                <w:color w:val="000000"/>
-                <w:lang w:eastAsia="en-AE"/>
-              </w:rPr>
-            </w:pPr>
-          </w:p>
-        </w:tc>
-        <w:tc>
-          <w:tcPr>
-            <w:tcW w:w="937" w:type="pct"/>
-            <w:tcBorders>
-              <w:top w:val="nil"/>
-              <w:left w:val="nil"/>
-              <w:bottom w:val="single" w:sz="4" w:space="0" w:color="auto"/>
-              <w:right w:val="single" w:sz="4" w:space="0" w:color="auto"/>
-            </w:tcBorders>
-            <w:noWrap/>
-            <w:vAlign w:val="bottom"/>
-          </w:tcPr>
-          <w:p>
-            <w:pPr>
-              <w:spacing w:after="0" w:line="240" w:lineRule="auto"/>
-              <w:rPr>
-                <w:rFonts w:ascii="Calibri" w:eastAsia="Times New Roman" w:hAnsi="Calibri" w:cs="Calibri"/>
-                <w:color w:val="000000"/>
-                <w:lang w:eastAsia="en-AE"/>
-              </w:rPr>
-            </w:pPr>
-          </w:p>
-        </w:tc>
-      </w:tr>
-      <w:tr>
-        <w:trPr>
-          <w:trHeight w:val="361"/>
-        </w:trPr>
-        <w:tc>
-          <w:tcPr>
-            <w:tcW w:w="252" w:type="pct"/>
-            <w:tcBorders>
-              <w:top w:val="nil"/>
-              <w:left w:val="single" w:sz="4" w:space="0" w:color="auto"/>
-              <w:bottom w:val="single" w:sz="4" w:space="0" w:color="auto"/>
-              <w:right w:val="single" w:sz="4" w:space="0" w:color="auto"/>
-            </w:tcBorders>
-            <w:noWrap/>
-            <w:vAlign w:val="bottom"/>
-          </w:tcPr>
-          <w:p>
-            <w:pPr>
-              <w:spacing w:after="0" w:line="240" w:lineRule="auto"/>
-              <w:rPr>
-                <w:rFonts w:ascii="Calibri" w:eastAsia="Times New Roman" w:hAnsi="Calibri" w:cs="Calibri"/>
-                <w:color w:val="000000"/>
-                <w:lang w:eastAsia="en-AE"/>
-              </w:rPr>
-            </w:pPr>
-          </w:p>
-        </w:tc>
-        <w:tc>
-          <w:tcPr>
-            <w:tcW w:w="376" w:type="pct"/>
-            <w:tcBorders>
-              <w:top w:val="nil"/>
-              <w:left w:val="nil"/>
-              <w:bottom w:val="single" w:sz="4" w:space="0" w:color="auto"/>
-              <w:right w:val="single" w:sz="4" w:space="0" w:color="auto"/>
-            </w:tcBorders>
-            <w:noWrap/>
-            <w:vAlign w:val="bottom"/>
-          </w:tcPr>
-          <w:p>
-            <w:pPr>
-              <w:spacing w:after="0" w:line="240" w:lineRule="auto"/>
-              <w:rPr>
-                <w:rFonts w:ascii="Calibri" w:eastAsia="Times New Roman" w:hAnsi="Calibri" w:cs="Calibri"/>
-                <w:color w:val="000000"/>
-                <w:lang w:eastAsia="en-AE"/>
-              </w:rPr>
-            </w:pPr>
-          </w:p>
-        </w:tc>
-        <w:tc>
-          <w:tcPr>
-            <w:tcW w:w="793" w:type="pct"/>
-            <w:tcBorders>
-              <w:top w:val="nil"/>
-              <w:left w:val="nil"/>
-              <w:bottom w:val="single" w:sz="4" w:space="0" w:color="auto"/>
-              <w:right w:val="single" w:sz="4" w:space="0" w:color="auto"/>
-            </w:tcBorders>
-            <w:noWrap/>
-            <w:vAlign w:val="bottom"/>
-          </w:tcPr>
-          <w:p>
-            <w:pPr>
-              <w:spacing w:after="0" w:line="240" w:lineRule="auto"/>
-              <w:rPr>
-                <w:rFonts w:ascii="Calibri" w:eastAsia="Times New Roman" w:hAnsi="Calibri" w:cs="Calibri"/>
-                <w:color w:val="000000"/>
-                <w:lang w:eastAsia="en-AE"/>
-              </w:rPr>
-            </w:pPr>
-          </w:p>
-        </w:tc>
-        <w:tc>
-          <w:tcPr>
-            <w:tcW w:w="610" w:type="pct"/>
-            <w:gridSpan w:val="2"/>
-            <w:tcBorders>
-              <w:top w:val="nil"/>
-              <w:left w:val="nil"/>
-              <w:bottom w:val="single" w:sz="4" w:space="0" w:color="auto"/>
-              <w:right w:val="single" w:sz="4" w:space="0" w:color="auto"/>
-            </w:tcBorders>
-            <w:noWrap/>
-            <w:vAlign w:val="bottom"/>
-          </w:tcPr>
-          <w:p>
-            <w:pPr>
-              <w:spacing w:after="0" w:line="240" w:lineRule="auto"/>
-              <w:rPr>
-                <w:rFonts w:ascii="Calibri" w:eastAsia="Times New Roman" w:hAnsi="Calibri" w:cs="Calibri"/>
-                <w:color w:val="000000"/>
-                <w:lang w:eastAsia="en-AE"/>
-              </w:rPr>
-            </w:pPr>
-          </w:p>
-        </w:tc>
-        <w:tc>
-          <w:tcPr>
-            <w:tcW w:w="496" w:type="pct"/>
-            <w:tcBorders>
-              <w:top w:val="nil"/>
-              <w:left w:val="nil"/>
-              <w:bottom w:val="single" w:sz="4" w:space="0" w:color="auto"/>
-              <w:right w:val="single" w:sz="4" w:space="0" w:color="auto"/>
-            </w:tcBorders>
-            <w:noWrap/>
-            <w:vAlign w:val="bottom"/>
-          </w:tcPr>
-          <w:p>
-            <w:pPr>
-              <w:spacing w:after="0" w:line="240" w:lineRule="auto"/>
-              <w:rPr>
-                <w:rFonts w:ascii="Calibri" w:eastAsia="Times New Roman" w:hAnsi="Calibri" w:cs="Calibri"/>
-                <w:color w:val="000000"/>
-                <w:lang w:eastAsia="en-AE"/>
-              </w:rPr>
-            </w:pPr>
-          </w:p>
-        </w:tc>
-        <w:tc>
-          <w:tcPr>
-            <w:tcW w:w="418" w:type="pct"/>
-            <w:tcBorders>
-              <w:top w:val="nil"/>
-              <w:left w:val="nil"/>
-              <w:bottom w:val="single" w:sz="4" w:space="0" w:color="auto"/>
-              <w:right w:val="single" w:sz="4" w:space="0" w:color="auto"/>
-            </w:tcBorders>
-            <w:noWrap/>
-            <w:vAlign w:val="bottom"/>
-          </w:tcPr>
-          <w:p>
-            <w:pPr>
-              <w:spacing w:after="0" w:line="240" w:lineRule="auto"/>
-              <w:rPr>
-                <w:rFonts w:ascii="Calibri" w:eastAsia="Times New Roman" w:hAnsi="Calibri" w:cs="Calibri"/>
-                <w:color w:val="000000"/>
-                <w:lang w:eastAsia="en-AE"/>
-              </w:rPr>
-            </w:pPr>
-          </w:p>
-        </w:tc>
-        <w:tc>
-          <w:tcPr>
-            <w:tcW w:w="678" w:type="pct"/>
-            <w:tcBorders>
-              <w:top w:val="nil"/>
-              <w:left w:val="nil"/>
-              <w:bottom w:val="single" w:sz="4" w:space="0" w:color="auto"/>
-              <w:right w:val="single" w:sz="4" w:space="0" w:color="auto"/>
-            </w:tcBorders>
-            <w:noWrap/>
-            <w:vAlign w:val="bottom"/>
-          </w:tcPr>
-          <w:p>
-            <w:pPr>
-              <w:spacing w:after="0" w:line="240" w:lineRule="auto"/>
-              <w:rPr>
-                <w:rFonts w:ascii="Calibri" w:eastAsia="Times New Roman" w:hAnsi="Calibri" w:cs="Calibri"/>
-                <w:color w:val="000000"/>
-                <w:lang w:eastAsia="en-AE"/>
-              </w:rPr>
-            </w:pPr>
-          </w:p>
-        </w:tc>
-        <w:tc>
-          <w:tcPr>
-            <w:tcW w:w="440" w:type="pct"/>
-            <w:gridSpan w:val="2"/>
-            <w:tcBorders>
-              <w:top w:val="nil"/>
-              <w:left w:val="nil"/>
-              <w:bottom w:val="single" w:sz="4" w:space="0" w:color="auto"/>
-              <w:right w:val="single" w:sz="4" w:space="0" w:color="auto"/>
-            </w:tcBorders>
-            <w:noWrap/>
-            <w:vAlign w:val="bottom"/>
-          </w:tcPr>
-          <w:p>
-            <w:pPr>
-              <w:spacing w:after="0" w:line="240" w:lineRule="auto"/>
-              <w:rPr>
-                <w:rFonts w:ascii="Calibri" w:eastAsia="Times New Roman" w:hAnsi="Calibri" w:cs="Calibri"/>
-                <w:color w:val="000000"/>
-                <w:lang w:eastAsia="en-AE"/>
-              </w:rPr>
-            </w:pPr>
-          </w:p>
-        </w:tc>
-        <w:tc>
-          <w:tcPr>
-            <w:tcW w:w="937" w:type="pct"/>
-            <w:tcBorders>
-              <w:top w:val="nil"/>
-              <w:left w:val="nil"/>
-              <w:bottom w:val="single" w:sz="4" w:space="0" w:color="auto"/>
-              <w:right w:val="single" w:sz="4" w:space="0" w:color="auto"/>
-            </w:tcBorders>
-            <w:noWrap/>
-            <w:vAlign w:val="bottom"/>
-          </w:tcPr>
-          <w:p>
-            <w:pPr>
-              <w:spacing w:after="0" w:line="240" w:lineRule="auto"/>
-              <w:rPr>
-                <w:rFonts w:ascii="Calibri" w:eastAsia="Times New Roman" w:hAnsi="Calibri" w:cs="Calibri"/>
-                <w:color w:val="000000"/>
-                <w:lang w:eastAsia="en-AE"/>
-              </w:rPr>
-            </w:pPr>
-          </w:p>
-        </w:tc>
-      </w:tr>
-      <w:tr>
-        <w:trPr>
-          <w:trHeight w:val="361"/>
-        </w:trPr>
-        <w:tc>
-          <w:tcPr>
-            <w:tcW w:w="252" w:type="pct"/>
-            <w:tcBorders>
-              <w:top w:val="nil"/>
-              <w:left w:val="single" w:sz="4" w:space="0" w:color="auto"/>
-              <w:bottom w:val="single" w:sz="4" w:space="0" w:color="auto"/>
-              <w:right w:val="single" w:sz="4" w:space="0" w:color="auto"/>
-            </w:tcBorders>
-            <w:noWrap/>
-            <w:vAlign w:val="bottom"/>
-          </w:tcPr>
-          <w:p>
-            <w:pPr>
-              <w:spacing w:after="0" w:line="240" w:lineRule="auto"/>
-              <w:rPr>
-                <w:rFonts w:ascii="Calibri" w:eastAsia="Times New Roman" w:hAnsi="Calibri" w:cs="Calibri"/>
-                <w:color w:val="000000"/>
-                <w:lang w:eastAsia="en-AE"/>
-              </w:rPr>
-            </w:pPr>
-          </w:p>
-        </w:tc>
-        <w:tc>
-          <w:tcPr>
-            <w:tcW w:w="376" w:type="pct"/>
-            <w:tcBorders>
-              <w:top w:val="nil"/>
-              <w:left w:val="nil"/>
-              <w:bottom w:val="single" w:sz="4" w:space="0" w:color="auto"/>
-              <w:right w:val="single" w:sz="4" w:space="0" w:color="auto"/>
-            </w:tcBorders>
-            <w:noWrap/>
-            <w:vAlign w:val="bottom"/>
-          </w:tcPr>
-          <w:p>
-            <w:pPr>
-              <w:spacing w:after="0" w:line="240" w:lineRule="auto"/>
-              <w:rPr>
-                <w:rFonts w:ascii="Calibri" w:eastAsia="Times New Roman" w:hAnsi="Calibri" w:cs="Calibri"/>
-                <w:color w:val="000000"/>
-                <w:lang w:eastAsia="en-AE"/>
-              </w:rPr>
-            </w:pPr>
-          </w:p>
-        </w:tc>
-        <w:tc>
-          <w:tcPr>
-            <w:tcW w:w="793" w:type="pct"/>
-            <w:tcBorders>
-              <w:top w:val="nil"/>
-              <w:left w:val="nil"/>
-              <w:bottom w:val="single" w:sz="4" w:space="0" w:color="auto"/>
-              <w:right w:val="single" w:sz="4" w:space="0" w:color="auto"/>
-            </w:tcBorders>
-            <w:noWrap/>
-            <w:vAlign w:val="bottom"/>
-          </w:tcPr>
-          <w:p>
-            <w:pPr>
-              <w:spacing w:after="0" w:line="240" w:lineRule="auto"/>
-              <w:rPr>
-                <w:rFonts w:ascii="Calibri" w:eastAsia="Times New Roman" w:hAnsi="Calibri" w:cs="Calibri"/>
-                <w:color w:val="000000"/>
-                <w:lang w:eastAsia="en-AE"/>
-              </w:rPr>
-            </w:pPr>
-          </w:p>
-        </w:tc>
-        <w:tc>
-          <w:tcPr>
-            <w:tcW w:w="610" w:type="pct"/>
-            <w:gridSpan w:val="2"/>
-            <w:tcBorders>
-              <w:top w:val="nil"/>
-              <w:left w:val="nil"/>
-              <w:bottom w:val="single" w:sz="4" w:space="0" w:color="auto"/>
-              <w:right w:val="single" w:sz="4" w:space="0" w:color="auto"/>
-            </w:tcBorders>
-            <w:noWrap/>
-            <w:vAlign w:val="bottom"/>
-          </w:tcPr>
-          <w:p>
-            <w:pPr>
-              <w:spacing w:after="0" w:line="240" w:lineRule="auto"/>
-              <w:rPr>
-                <w:rFonts w:ascii="Calibri" w:eastAsia="Times New Roman" w:hAnsi="Calibri" w:cs="Calibri"/>
-                <w:color w:val="000000"/>
-                <w:lang w:eastAsia="en-AE"/>
-              </w:rPr>
-            </w:pPr>
-          </w:p>
-        </w:tc>
-        <w:tc>
-          <w:tcPr>
-            <w:tcW w:w="496" w:type="pct"/>
-            <w:tcBorders>
-              <w:top w:val="nil"/>
-              <w:left w:val="nil"/>
-              <w:bottom w:val="single" w:sz="4" w:space="0" w:color="auto"/>
-              <w:right w:val="single" w:sz="4" w:space="0" w:color="auto"/>
-            </w:tcBorders>
-            <w:noWrap/>
-            <w:vAlign w:val="bottom"/>
-          </w:tcPr>
-          <w:p>
-            <w:pPr>
-              <w:spacing w:after="0" w:line="240" w:lineRule="auto"/>
-              <w:rPr>
-                <w:rFonts w:ascii="Calibri" w:eastAsia="Times New Roman" w:hAnsi="Calibri" w:cs="Calibri"/>
-                <w:color w:val="000000"/>
-                <w:lang w:eastAsia="en-AE"/>
-              </w:rPr>
-            </w:pPr>
-          </w:p>
-        </w:tc>
-        <w:tc>
-          <w:tcPr>
-            <w:tcW w:w="418" w:type="pct"/>
-            <w:tcBorders>
-              <w:top w:val="nil"/>
-              <w:left w:val="nil"/>
-              <w:bottom w:val="single" w:sz="4" w:space="0" w:color="auto"/>
-              <w:right w:val="single" w:sz="4" w:space="0" w:color="auto"/>
-            </w:tcBorders>
-            <w:noWrap/>
-            <w:vAlign w:val="bottom"/>
-          </w:tcPr>
-          <w:p>
-            <w:pPr>
-              <w:spacing w:after="0" w:line="240" w:lineRule="auto"/>
-              <w:rPr>
-                <w:rFonts w:ascii="Calibri" w:eastAsia="Times New Roman" w:hAnsi="Calibri" w:cs="Calibri"/>
-                <w:color w:val="000000"/>
-                <w:lang w:eastAsia="en-AE"/>
-              </w:rPr>
-            </w:pPr>
-          </w:p>
-        </w:tc>
-        <w:tc>
-          <w:tcPr>
-            <w:tcW w:w="678" w:type="pct"/>
-            <w:tcBorders>
-              <w:top w:val="nil"/>
-              <w:left w:val="nil"/>
-              <w:bottom w:val="single" w:sz="4" w:space="0" w:color="auto"/>
-              <w:right w:val="single" w:sz="4" w:space="0" w:color="auto"/>
-            </w:tcBorders>
-            <w:noWrap/>
-            <w:vAlign w:val="bottom"/>
-          </w:tcPr>
-          <w:p>
-            <w:pPr>
-              <w:spacing w:after="0" w:line="240" w:lineRule="auto"/>
-              <w:rPr>
-                <w:rFonts w:ascii="Calibri" w:eastAsia="Times New Roman" w:hAnsi="Calibri" w:cs="Calibri"/>
-                <w:color w:val="000000"/>
-                <w:lang w:eastAsia="en-AE"/>
-              </w:rPr>
-            </w:pPr>
-          </w:p>
-        </w:tc>
-        <w:tc>
-          <w:tcPr>
-            <w:tcW w:w="440" w:type="pct"/>
-            <w:gridSpan w:val="2"/>
-            <w:tcBorders>
-              <w:top w:val="nil"/>
-              <w:left w:val="nil"/>
-              <w:bottom w:val="single" w:sz="4" w:space="0" w:color="auto"/>
-              <w:right w:val="single" w:sz="4" w:space="0" w:color="auto"/>
-            </w:tcBorders>
-            <w:noWrap/>
-            <w:vAlign w:val="bottom"/>
-          </w:tcPr>
-          <w:p>
-            <w:pPr>
-              <w:spacing w:after="0" w:line="240" w:lineRule="auto"/>
-              <w:rPr>
-                <w:rFonts w:ascii="Calibri" w:eastAsia="Times New Roman" w:hAnsi="Calibri" w:cs="Calibri"/>
-                <w:color w:val="000000"/>
-                <w:lang w:eastAsia="en-AE"/>
-              </w:rPr>
-            </w:pPr>
-          </w:p>
-        </w:tc>
-        <w:tc>
-          <w:tcPr>
-            <w:tcW w:w="937" w:type="pct"/>
-            <w:tcBorders>
-              <w:top w:val="nil"/>
-              <w:left w:val="nil"/>
-              <w:bottom w:val="single" w:sz="4" w:space="0" w:color="auto"/>
-              <w:right w:val="single" w:sz="4" w:space="0" w:color="auto"/>
-            </w:tcBorders>
-            <w:noWrap/>
-            <w:vAlign w:val="bottom"/>
-          </w:tcPr>
-          <w:p>
-            <w:pPr>
-              <w:spacing w:after="0" w:line="240" w:lineRule="auto"/>
-              <w:rPr>
-                <w:rFonts w:ascii="Calibri" w:eastAsia="Times New Roman" w:hAnsi="Calibri" w:cs="Calibri"/>
-                <w:color w:val="000000"/>
-                <w:lang w:eastAsia="en-AE"/>
-              </w:rPr>
-            </w:pPr>
           </w:p>
         </w:tc>
       </w:tr>

</xml_diff>